<commit_message>
Ch22: Gage learns Camilla saw the second rise and didn't tell him
Co-Authored-By: Claude Opus 5.5 <noreply@anthropic.com>
</commit_message>
<xml_diff>
--- a/claude-notes/manuscript-v2/22-the-door-beneath-merged.docx
+++ b/claude-notes/manuscript-v2/22-the-door-beneath-merged.docx
@@ -529,6 +529,96 @@
           <w:i w:val="0"/>
           <w:strike w:val="0"/>
         </w:rPr>
+        <w:t>The younger medic had the night log open on the panel. She turned back a page to check something against the older woman's square hand, and read it half aloud, for her own count. "Second rise. Evening. Present: Ben. Camilla."</w:t>
+      </w:r>
+    </w:p>
+    <w:p>
+      <w:r>
+        <w:rPr>
+          <w:b w:val="0"/>
+          <w:i w:val="0"/>
+          <w:strike w:val="0"/>
+        </w:rPr>
+        <w:t>Gage lifted his head off the blanket.</w:t>
+      </w:r>
+    </w:p>
+    <w:p>
+      <w:r>
+        <w:rPr>
+          <w:b w:val="0"/>
+          <w:i w:val="0"/>
+          <w:strike w:val="0"/>
+        </w:rPr>
+        <w:t>He didn't look at the log. He looked at Camilla. His hands stayed where they were, closed round Otto's.</w:t>
+      </w:r>
+    </w:p>
+    <w:p>
+      <w:r>
+        <w:rPr>
+          <w:b w:val="0"/>
+          <w:i w:val="0"/>
+          <w:strike w:val="0"/>
+        </w:rPr>
+        <w:t>"Evening," he said.</w:t>
+      </w:r>
+    </w:p>
+    <w:p>
+      <w:r>
+        <w:rPr>
+          <w:b w:val="0"/>
+          <w:i w:val="0"/>
+          <w:strike w:val="0"/>
+        </w:rPr>
+        <w:t>"Yes."</w:t>
+      </w:r>
+    </w:p>
+    <w:p>
+      <w:r>
+        <w:rPr>
+          <w:b w:val="0"/>
+          <w:i w:val="0"/>
+          <w:strike w:val="0"/>
+        </w:rPr>
+        <w:t>"I was in the workshop. Building it."</w:t>
+      </w:r>
+    </w:p>
+    <w:p>
+      <w:r>
+        <w:rPr>
+          <w:b w:val="0"/>
+          <w:i w:val="0"/>
+          <w:strike w:val="0"/>
+        </w:rPr>
+        <w:t>"I know. I was at the door."</w:t>
+      </w:r>
+    </w:p>
+    <w:p>
+      <w:r>
+        <w:rPr>
+          <w:b w:val="0"/>
+          <w:i w:val="0"/>
+          <w:strike w:val="0"/>
+        </w:rPr>
+        <w:t>He looked at her for a long time. Then he put his head back down on the blanket, beside Otto's hand, and turned his face to the wall.</w:t>
+      </w:r>
+    </w:p>
+    <w:p>
+      <w:r>
+        <w:rPr>
+          <w:b w:val="0"/>
+          <w:i w:val="0"/>
+          <w:strike w:val="0"/>
+        </w:rPr>
+        <w:t>Ben looked at the floor. The younger medic closed the log without a sound.</w:t>
+      </w:r>
+    </w:p>
+    <w:p>
+      <w:r>
+        <w:rPr>
+          <w:b w:val="0"/>
+          <w:i w:val="0"/>
+          <w:strike w:val="0"/>
+        </w:rPr>
         <w:t>---</w:t>
       </w:r>
     </w:p>
@@ -629,7 +719,7 @@
           <w:i w:val="0"/>
           <w:strike w:val="0"/>
         </w:rPr>
-        <w:t>She went back up and stood in the tank-room doorway. The tank was empty and drying, a blue tidemark round its base. Gage was in the chair by the bed with his hands still closed round Otto's, his head down on the blanket beside them, asleep or not.</w:t>
+        <w:t>She went back up and stood in the tank-room doorway. The tank was empty and drying, a blue tidemark round its base. Gage was in the chair by the bed with his hands still closed round Otto's, his head down on the blanket beside them, his face still turned to the wall, asleep or not.</w:t>
       </w:r>
     </w:p>
     <w:p>
@@ -669,7 +759,7 @@
           <w:i w:val="0"/>
           <w:strike w:val="0"/>
         </w:rPr>
-        <w:t>She counted the room one more time, by habit, and got to four, and all four of them were breathing on their own, and she had to put her good hand on the doorframe.</w:t>
+        <w:t>She counted the room one more time, by habit, and got to four, and all four of them were breathing on their own, and one of them had his back to her. She had to put her good hand on the doorframe.</w:t>
       </w:r>
     </w:p>
     <w:p>

</xml_diff>

<commit_message>
Ch22 v1 review: the gate-log threat, register beat, folio line, POV and trims
- Elara works out the gate log + digest exposure; Rohan's scene moves it forward
- Register: Kubera struck the name, Drona's book still has him in a room
- 'The morning after the slip'; folio's underlined line shown (purpose only; authority held for ch30)
- POV fix at L143; similes/epigrams trimmed; count includes Ben downstairs

Co-Authored-By: Claude Opus 5.5 <noreply@anthropic.com>
</commit_message>
<xml_diff>
--- a/claude-notes/manuscript-v2/22-the-door-beneath-merged.docx
+++ b/claude-notes/manuscript-v2/22-the-door-beneath-merged.docx
@@ -63,17 +63,17 @@
           <w:i w:val="0"/>
           <w:strike w:val="0"/>
         </w:rPr>
-        <w:t>She'd slept in her greys with her boots on. They all had, since the medic sent them down from the glass at the end of last night's watch. Gage came off his cot so fast it skated across the floor and knocked the bench, and a box of splinters went over in a dry rattle. Ben was already at the door with one sock on and the other in his hand.</w:t>
-      </w:r>
-    </w:p>
-    <w:p>
-      <w:r>
-        <w:rPr>
-          <w:b w:val="0"/>
-          <w:i w:val="0"/>
-          <w:strike w:val="0"/>
-        </w:rPr>
-        <w:t>Nobody said Otto's name. Saying it would have made it a question.</w:t>
+        <w:t>She'd slept in her greys with her boots on. They all had, every night since the tank. Gage came off his cot so fast it skated across the floor and knocked the bench, and a box of splinters went over in a dry rattle. Ben was already at the door with one sock on and the other in his hand.</w:t>
+      </w:r>
+    </w:p>
+    <w:p>
+      <w:r>
+        <w:rPr>
+          <w:b w:val="0"/>
+          <w:i w:val="0"/>
+          <w:strike w:val="0"/>
+        </w:rPr>
+        <w:t>Nobody said Otto's name.</w:t>
       </w:r>
     </w:p>
     <w:p>
@@ -183,7 +183,7 @@
           <w:i w:val="0"/>
           <w:strike w:val="0"/>
         </w:rPr>
-        <w:t>It took a long time. The arm rose through the gel like a man hauling a full bucket, and Camilla watched the elbow argue with every inch. Then the palm met the glass and flattened there, white at the heel, at the exact height where Ben had left two prints on the first morning.</w:t>
+        <w:t>It took a long time. The arm rose through the gel an inch at a time, the elbow arguing with every one. Then the palm met the glass and flattened there, white at the heel, at the exact height where Ben had left two prints on the first morning.</w:t>
       </w:r>
     </w:p>
     <w:p>
@@ -709,7 +709,7 @@
           <w:i w:val="0"/>
           <w:strike w:val="0"/>
         </w:rPr>
-        <w:t>Neither of them said anything else. There was nothing to say that either of them could check.</w:t>
+        <w:t>Neither of them said anything else.</w:t>
       </w:r>
     </w:p>
     <w:p>
@@ -739,7 +739,7 @@
           <w:i w:val="0"/>
           <w:strike w:val="0"/>
         </w:rPr>
-        <w:t>Otto didn't know about the Lake Wall, or the valves, or the ten minutes, or the listener under its cloth on her bench that heard everything and couldn't yet tell rock from footsteps, or who might have to be in the tunnel the water wanted first. He'd come up a rope, and the first thing he'd asked was whether the people he'd held things up for had got out.</w:t>
+        <w:t>Otto didn't know about the Lake Wall, or the valves, or who might have to be in the tunnel the water wanted first. He'd been awake an hour, and the first thing he'd asked was whether the people he'd held things up for had got out.</w:t>
       </w:r>
     </w:p>
     <w:p>
@@ -759,7 +759,7 @@
           <w:i w:val="0"/>
           <w:strike w:val="0"/>
         </w:rPr>
-        <w:t>She counted the room one more time, by habit, and got to four, and all four of them were breathing on their own, and one of them had his back to her. She had to put her good hand on the doorframe.</w:t>
+        <w:t>She counted them one more time, by habit, Ben downstairs included, and got to four, and all four of them were breathing on their own, and one of them had his back to her. She had to put her good hand on the doorframe.</w:t>
       </w:r>
     </w:p>
     <w:p>
@@ -779,7 +779,7 @@
           <w:i w:val="0"/>
           <w:strike w:val="0"/>
         </w:rPr>
-        <w:t>Three mornings later, the records archive opened at first bell.</w:t>
+        <w:t>The morning after the slip, the records archive opened at first bell.</w:t>
       </w:r>
     </w:p>
     <w:p>
@@ -869,7 +869,7 @@
           <w:i w:val="0"/>
           <w:strike w:val="0"/>
         </w:rPr>
-        <w:t>She brought it from the stacks in a grey sleeve. The custody ledger lay open at the end of the counter, its pen tied on with a string a hand too short, so that he had to stoop to sign. He signed beneath the file number. His signature had changed in three years; he hadn't noticed until he saw the old one above it. The ink sat on the page and dried, and it would still be there in a hundred years.</w:t>
+        <w:t>She brought it from the stacks in a card sleeve. The custody ledger lay open at the end of the counter, its pen tied on with a string a hand too short, so that he had to stoop to sign. He signed beneath the file number. His signature had changed in three years; he hadn't noticed until he saw the old one above it. The ink sat on the page and dried.</w:t>
       </w:r>
     </w:p>
     <w:p>
@@ -899,7 +899,7 @@
           <w:i w:val="0"/>
           <w:strike w:val="0"/>
         </w:rPr>
-        <w:t>He didn't know if he could keep it. He said it in the voice of a man who could.</w:t>
+        <w:t>He didn't know if he could keep it.</w:t>
       </w:r>
     </w:p>
     <w:p>
@@ -945,7 +945,23 @@
           <w:i w:val="0"/>
           <w:strike w:val="0"/>
         </w:rPr>
-        <w:t>He'd underlined it in pencil the night he filed it, because it was the one line he couldn't make sit still with the rest. The pencil had gone grey and furred. It was still underlined. It was still waiting for someone above him to say what it meant.</w:t>
+        <w:t xml:space="preserve">He'd underlined it in pencil the night he filed it, because it was the one line he couldn't make sit still with the rest. </w:t>
+      </w:r>
+      <w:r>
+        <w:rPr>
+          <w:b w:val="0"/>
+          <w:i/>
+          <w:strike w:val="0"/>
+        </w:rPr>
+        <w:t>Continuity Reserve transfer, Kubera to Chanakya. Purpose: survey of the archive wing, preliminary.</w:t>
+      </w:r>
+      <w:r>
+        <w:rPr>
+          <w:b w:val="0"/>
+          <w:i w:val="0"/>
+          <w:strike w:val="0"/>
+        </w:rPr>
+        <w:t xml:space="preserve"> Nobody in Chanakya had asked for a survey of the archive wing, three years ago. This week there were surveyors in it with knotted string. What he'd flagged was the authority on the line beneath, and he didn't need to read that again. The pencil had gone grey and furred. It was still underlined. It was still waiting for someone above him to say what it meant.</w:t>
       </w:r>
     </w:p>
     <w:p>
@@ -1036,7 +1052,7 @@
           <w:i w:val="0"/>
           <w:strike w:val="0"/>
         </w:rPr>
-        <w:t>His hand went to his coat before he could stop it, flat over the folio. He'd signed for it an hour ago, in ink, in a building no instrument could see into.</w:t>
+        <w:t>His hand went to his coat before he could stop it, flat over the folio. He'd signed for it an hour ago, in ink, in a hall no instrument watched.</w:t>
       </w:r>
     </w:p>
     <w:p>
@@ -1143,7 +1159,7 @@
           <w:i w:val="0"/>
           <w:strike w:val="0"/>
         </w:rPr>
-        <w:t>A name and a room, both lawful to read. A Kubera monitor had been given a room on the fourth level for a watch that ended weeks ago, and nobody had written that he gave it back. The page said nothing about who walked into that room at night, or whose door opened before the hand was raised. A clerk had left a column blank. Clerks did.</w:t>
+        <w:t>A name and a room, both lawful to read. A Kubera monitor had been given a room on the fourth level for a watch that ended weeks ago, and nobody had written that he gave it back. The page said nothing about who walked into that room at night, or whose door opened before the hand was raised. Kubera had taken that name off him in front of the whole house. Drona's book still had it, and still had him in a room.</w:t>
       </w:r>
     </w:p>
     <w:p>
@@ -1336,16 +1352,6 @@
           <w:i w:val="0"/>
           <w:strike w:val="0"/>
         </w:rPr>
-        <w:t>The back of Elara's neck went cold. She hadn't seen any reader. She'd been counting steps.</w:t>
-      </w:r>
-    </w:p>
-    <w:p>
-      <w:r>
-        <w:rPr>
-          <w:b w:val="0"/>
-          <w:i w:val="0"/>
-          <w:strike w:val="0"/>
-        </w:rPr>
         <w:t>"It won't know who."</w:t>
       </w:r>
     </w:p>
@@ -1366,6 +1372,46 @@
           <w:i w:val="0"/>
           <w:strike w:val="0"/>
         </w:rPr>
+        <w:t>The stair gate had her code. Rohan's under it, an hour early, and both of them again on the way out. Between them, at the hand's hour, two people no sensor could name.</w:t>
+      </w:r>
+    </w:p>
+    <w:p>
+      <w:r>
+        <w:rPr>
+          <w:b w:val="0"/>
+          <w:i w:val="0"/>
+          <w:strike w:val="0"/>
+        </w:rPr>
+        <w:t>"It will," Elara said. "If it lays the gate log beside the digest."</w:t>
+      </w:r>
+    </w:p>
+    <w:p>
+      <w:r>
+        <w:rPr>
+          <w:b w:val="0"/>
+          <w:i w:val="0"/>
+          <w:strike w:val="0"/>
+        </w:rPr>
+        <w:t>"It reads records," the Ancient One said.</w:t>
+      </w:r>
+    </w:p>
+    <w:p>
+      <w:r>
+        <w:rPr>
+          <w:b w:val="0"/>
+          <w:i w:val="0"/>
+          <w:strike w:val="0"/>
+        </w:rPr>
+        <w:t>The back of Elara's neck went cold.</w:t>
+      </w:r>
+    </w:p>
+    <w:p>
+      <w:r>
+        <w:rPr>
+          <w:b w:val="0"/>
+          <w:i w:val="0"/>
+          <w:strike w:val="0"/>
+        </w:rPr>
         <w:t>The old woman looked down at the map, and Elara made herself look too.</w:t>
       </w:r>
     </w:p>
@@ -1586,16 +1632,6 @@
           <w:i w:val="0"/>
           <w:strike w:val="0"/>
         </w:rPr>
-        <w:t>Dark, the wall showed nothing. Lit, it would show every order the hand gave, and the hour it gave it.</w:t>
-      </w:r>
-    </w:p>
-    <w:p>
-      <w:r>
-        <w:rPr>
-          <w:b w:val="0"/>
-          <w:i w:val="0"/>
-          <w:strike w:val="0"/>
-        </w:rPr>
         <w:t>"And I'm not in the room."</w:t>
       </w:r>
     </w:p>
@@ -1716,27 +1752,17 @@
           <w:i w:val="0"/>
           <w:strike w:val="0"/>
         </w:rPr>
-        <w:t>"Then it'll be in the overnight digest," she said. "Two people it couldn't name." Her voice stayed level, and she was glad of it. "And it reads records."</w:t>
-      </w:r>
-    </w:p>
-    <w:p>
-      <w:r>
-        <w:rPr>
-          <w:b w:val="0"/>
-          <w:i w:val="0"/>
-          <w:strike w:val="0"/>
-        </w:rPr>
-        <w:t>"Then it knows two people stood there." He laid it out in order, what they had. "It doesn't know who. It knows there were two."</w:t>
-      </w:r>
-    </w:p>
-    <w:p>
-      <w:r>
-        <w:rPr>
-          <w:b w:val="0"/>
-          <w:i w:val="0"/>
-          <w:strike w:val="0"/>
-        </w:rPr>
-        <w:t>He was quiet. Somewhere above them, his Grandmaster didn't know any of this.</w:t>
+        <w:t>"Then it's in the overnight digest. Two people it couldn't name." She kept her voice level. "Between two gate entries it can."</w:t>
+      </w:r>
+    </w:p>
+    <w:p>
+      <w:r>
+        <w:rPr>
+          <w:b w:val="0"/>
+          <w:i w:val="0"/>
+          <w:strike w:val="0"/>
+        </w:rPr>
+        <w:t>"I'd worked that out before we reached the bottom." He didn't look away from the flame. "Anyone who sets the gate log beside the digest has us by the end of the page."</w:t>
       </w:r>
     </w:p>
     <w:p>

</xml_diff>

<commit_message>
Ch22 round 3: Ravi's loose threads, digest once, Flitzberg's nineteen, trims
Co-Authored-By: Claude Opus 5.5 <noreply@anthropic.com>
</commit_message>
<xml_diff>
--- a/claude-notes/manuscript-v2/22-the-door-beneath-merged.docx
+++ b/claude-notes/manuscript-v2/22-the-door-beneath-merged.docx
@@ -143,7 +143,7 @@
           <w:i w:val="0"/>
           <w:strike w:val="0"/>
         </w:rPr>
-        <w:t>The grey-haired medic leaned to a small grille in the base of the tank. When she spoke, her voice came out of the glass itself, flattened and late, from the bottom of a well.</w:t>
+        <w:t>The grey-haired medic leaned to a small grille in the base of the tank. When she spoke, her voice came out of the glass itself, flattened and a beat late.</w:t>
       </w:r>
     </w:p>
     <w:p>
@@ -213,7 +213,7 @@
           <w:i w:val="0"/>
           <w:strike w:val="0"/>
         </w:rPr>
-        <w:t>Otto's palm stayed where it was, under Gage's hands. Camilla watched his chest. It rose by itself, without the tank doing it for him. Whatever had held him hadn't broken. It had loosened.</w:t>
+        <w:t>Otto's palm stayed where it was, under Gage's hands. Camilla watched his chest. It rose by itself, without the tank doing it for him.</w:t>
       </w:r>
     </w:p>
     <w:p>
@@ -449,7 +449,7 @@
           <w:i w:val="0"/>
           <w:strike w:val="0"/>
         </w:rPr>
-        <w:t>Then his eyes found her, and went past her face, and stopped on her left side.</w:t>
+        <w:t>Then Otto's eyes found her, and went past her face, and stopped on her left side.</w:t>
       </w:r>
     </w:p>
     <w:p>
@@ -729,7 +729,7 @@
           <w:i w:val="0"/>
           <w:strike w:val="0"/>
         </w:rPr>
-        <w:t>Twelve left, the evening of the egg. One night on from that. Eleven left of the nineteen.</w:t>
+        <w:t>Eleven nights left of Flitzberg's nineteen.</w:t>
       </w:r>
     </w:p>
     <w:p>
@@ -961,7 +961,7 @@
           <w:i w:val="0"/>
           <w:strike w:val="0"/>
         </w:rPr>
-        <w:t xml:space="preserve"> Nobody in Chanakya had asked for a survey of the archive wing, three years ago. This week there were surveyors in it with knotted string. What he'd flagged was the authority on the line beneath, and he didn't need to read that again. The pencil had gone grey and furred. It was still underlined. It was still waiting for someone above him to say what it meant.</w:t>
+        <w:t xml:space="preserve"> Nobody in Chanakya had asked for a survey of the archive wing, three years ago. This week there were surveyors in it with knotted string. What he'd flagged was the line beneath. He could have recited it. The house had sealed it before he understood it, and he still didn't. The pencil had gone grey and furred. It was still underlined.</w:t>
       </w:r>
     </w:p>
     <w:p>
@@ -981,7 +981,7 @@
           <w:i w:val="0"/>
           <w:strike w:val="0"/>
         </w:rPr>
-        <w:t>Two hours after first bell, he went to Room Four.</w:t>
+        <w:t>Two hours after first bell, he went to Room Four. The slip had said two hours. Yesterday he'd let them pass with nothing to carry.</w:t>
       </w:r>
     </w:p>
     <w:p>
@@ -1021,7 +1021,7 @@
           <w:i w:val="0"/>
           <w:strike w:val="0"/>
         </w:rPr>
-        <w:t>He knew the tape. The binder had been pushed into his arms in a doorway, by a grey sleeve and a heel against a door, and he'd looked for the face and found the door.</w:t>
+        <w:t>He knew the tape. The binder had been pushed into his arms in a doorway, by a grey sleeve and a heel against a door, and he'd looked for the face and found the door. He'd put it on the returns trolley yesterday afternoon.</w:t>
       </w:r>
     </w:p>
     <w:p>
@@ -1052,7 +1052,7 @@
           <w:i w:val="0"/>
           <w:strike w:val="0"/>
         </w:rPr>
-        <w:t>His hand went to his coat before he could stop it, flat over the folio. He'd signed for it an hour ago, in ink, in a hall no instrument watched.</w:t>
+        <w:t>His hand went to his coat before he could stop it, flat over the folio. He'd signed for it an hour ago, in ink, in a hall no instrument watched. No one had been in the index hall but the clerk. He hadn't seen the porter, either, until the binder was in his arms.</w:t>
       </w:r>
     </w:p>
     <w:p>
@@ -1169,7 +1169,7 @@
           <w:i w:val="0"/>
           <w:strike w:val="0"/>
         </w:rPr>
-        <w:t>She copied the line onto a slip in pencil, with the volume's shelf mark, and thanked the clerk. He sneezed, and said bless you to his handkerchief.</w:t>
+        <w:t>She copied the line onto a slip in pencil, with the volume's shelf mark, and thanked the clerk.</w:t>
       </w:r>
     </w:p>
     <w:p>
@@ -1442,7 +1442,7 @@
           <w:i w:val="0"/>
           <w:strike w:val="0"/>
         </w:rPr>
-        <w:t>"Something I swore never to name, and I will keep the oath even now." The Ancient One rested one finger on the empty paper. "Once a year, the four of us are taken to sit before it. None of us knows where we go. That is how it was built. But it can be asked to sit out of season, and I am going to ask."</w:t>
+        <w:t>"Something I swore never to name, and I will keep the oath even now." The Ancient One rested one finger on the empty paper. "Once a year, the four of us are taken to sit at its table. None of us knows where we go. That is how it was built. But it can be asked to sit out of season, and I am going to ask."</w:t>
       </w:r>
     </w:p>
     <w:p>
@@ -1752,17 +1752,17 @@
           <w:i w:val="0"/>
           <w:strike w:val="0"/>
         </w:rPr>
-        <w:t>"Then it's in the overnight digest. Two people it couldn't name." She kept her voice level. "Between two gate entries it can."</w:t>
-      </w:r>
-    </w:p>
-    <w:p>
-      <w:r>
-        <w:rPr>
-          <w:b w:val="0"/>
-          <w:i w:val="0"/>
-          <w:strike w:val="0"/>
-        </w:rPr>
-        <w:t>"I'd worked that out before we reached the bottom." He didn't look away from the flame. "Anyone who sets the gate log beside the digest has us by the end of the page."</w:t>
+        <w:t>"Then it's in the overnight digest. Between our two gate entries."</w:t>
+      </w:r>
+    </w:p>
+    <w:p>
+      <w:r>
+        <w:rPr>
+          <w:b w:val="0"/>
+          <w:i w:val="0"/>
+          <w:strike w:val="0"/>
+        </w:rPr>
+        <w:t>"I'd worked that out before we reached the bottom."</w:t>
       </w:r>
     </w:p>
     <w:p>

</xml_diff>

<commit_message>
Ch22 round 4: the requester dash, the unlocked door, the medic's count, the wall line
Co-Authored-By: Claude Opus 5.5 <noreply@anthropic.com>
</commit_message>
<xml_diff>
--- a/claude-notes/manuscript-v2/22-the-door-beneath-merged.docx
+++ b/claude-notes/manuscript-v2/22-the-door-beneath-merged.docx
@@ -529,7 +529,7 @@
           <w:i w:val="0"/>
           <w:strike w:val="0"/>
         </w:rPr>
-        <w:t>The younger medic had the night log open on the panel. She turned back a page to check something against the older woman's square hand, and read it half aloud, for her own count. "Second rise. Evening. Present: Ben. Camilla."</w:t>
+        <w:t>The younger medic had the night log open on the panel. She turned back a page to enter the rise against the last one, and read the last one half aloud, for her own count. "Second rise. Evening. Present: Ben. Camilla."</w:t>
       </w:r>
     </w:p>
     <w:p>
@@ -953,15 +953,15 @@
           <w:i/>
           <w:strike w:val="0"/>
         </w:rPr>
-        <w:t>Continuity Reserve transfer, Kubera to Chanakya. Purpose: survey of the archive wing, preliminary.</w:t>
-      </w:r>
-      <w:r>
-        <w:rPr>
-          <w:b w:val="0"/>
-          <w:i w:val="0"/>
-          <w:strike w:val="0"/>
-        </w:rPr>
-        <w:t xml:space="preserve"> Nobody in Chanakya had asked for a survey of the archive wing, three years ago. This week there were surveyors in it with knotted string. What he'd flagged was the line beneath. He could have recited it. The house had sealed it before he understood it, and he still didn't. The pencil had gone grey and furred. It was still underlined.</w:t>
+        <w:t>Transfer, Kubera to Chanakya. Purpose: survey of the archive wing, preliminary.</w:t>
+      </w:r>
+      <w:r>
+        <w:rPr>
+          <w:b w:val="0"/>
+          <w:i w:val="0"/>
+          <w:strike w:val="0"/>
+        </w:rPr>
+        <w:t xml:space="preserve"> Nobody in Chanakya had asked for a survey of the archive wing, three years ago. This week there were surveyors in it with knotted string. Beneath it, in the field for the requesting officer, a single dash. That was what he'd flagged. The house had sealed it before he understood it, and he still didn't. The pencil had gone grey and furred. It was still underlined.</w:t>
       </w:r>
     </w:p>
     <w:p>
@@ -1001,7 +1001,7 @@
           <w:i w:val="0"/>
           <w:strike w:val="0"/>
         </w:rPr>
-        <w:t>He opened the door anyway.</w:t>
+        <w:t>The door should have been locked. It wasn't. He opened it anyway.</w:t>
       </w:r>
     </w:p>
     <w:p>
@@ -1272,7 +1272,7 @@
           <w:i w:val="0"/>
           <w:strike w:val="0"/>
         </w:rPr>
-        <w:t>"You were in the fourth-level corridor last night," the Ancient One said. "Anandi told me where you stood. The wall told me what walked past you."</w:t>
+        <w:t>"You were in the fourth-level corridor last night," the Ancient One said. "Anandi told me where you stood. The wall told me what the hand did beside you."</w:t>
       </w:r>
     </w:p>
     <w:p>

</xml_diff>